<commit_message>
Updated final report content
</commit_message>
<xml_diff>
--- a/docs/major-project-report.docx
+++ b/docs/major-project-report.docx
@@ -126,7 +126,7 @@
     <w:p>
       <w:r>
         <w:pict w14:anchorId="78B03D03">
-          <v:rect id="_x0000_i1043" style="width:0;height:1.5pt" o:hralign="center" o:hrstd="t" o:hr="t" fillcolor="#a0a0a0" stroked="f"/>
+          <v:rect id="_x0000_i1025" style="width:0;height:1.5pt" o:hralign="center" o:hrstd="t" o:hr="t" fillcolor="#a0a0a0" stroked="f"/>
         </w:pict>
       </w:r>
     </w:p>
@@ -206,7 +206,7 @@
     <w:p>
       <w:r>
         <w:pict w14:anchorId="1C219B78">
-          <v:rect id="_x0000_i1044" style="width:0;height:1.5pt" o:hralign="center" o:hrstd="t" o:hr="t" fillcolor="#a0a0a0" stroked="f"/>
+          <v:rect id="_x0000_i1026" style="width:0;height:1.5pt" o:hralign="center" o:hrstd="t" o:hr="t" fillcolor="#a0a0a0" stroked="f"/>
         </w:pict>
       </w:r>
     </w:p>
@@ -258,7 +258,7 @@
     <w:p>
       <w:r>
         <w:pict w14:anchorId="50561C57">
-          <v:rect id="_x0000_i1045" style="width:0;height:1.5pt" o:hralign="center" o:hrstd="t" o:hr="t" fillcolor="#a0a0a0" stroked="f"/>
+          <v:rect id="_x0000_i1027" style="width:0;height:1.5pt" o:hralign="center" o:hrstd="t" o:hr="t" fillcolor="#a0a0a0" stroked="f"/>
         </w:pict>
       </w:r>
     </w:p>
@@ -335,7 +335,7 @@
     <w:p>
       <w:r>
         <w:pict w14:anchorId="7A6F14DA">
-          <v:rect id="_x0000_i1061" style="width:0;height:1.5pt" o:hralign="center" o:hrstd="t" o:hr="t" fillcolor="#a0a0a0" stroked="f"/>
+          <v:rect id="_x0000_i1028" style="width:0;height:1.5pt" o:hralign="center" o:hrstd="t" o:hr="t" fillcolor="#a0a0a0" stroked="f"/>
         </w:pict>
       </w:r>
     </w:p>
@@ -347,7 +347,7 @@
     <w:p>
       <w:r>
         <w:pict w14:anchorId="127FF4A5">
-          <v:rect id="_x0000_i1062" style="width:0;height:1.5pt" o:hralign="center" o:hrstd="t" o:hr="t" fillcolor="#a0a0a0" stroked="f"/>
+          <v:rect id="_x0000_i1029" style="width:0;height:1.5pt" o:hralign="center" o:hrstd="t" o:hr="t" fillcolor="#a0a0a0" stroked="f"/>
         </w:pict>
       </w:r>
     </w:p>
@@ -410,7 +410,7 @@
     <w:p>
       <w:r>
         <w:pict w14:anchorId="0E6A502F">
-          <v:rect id="_x0000_i1071" style="width:0;height:1.5pt" o:hralign="center" o:hrstd="t" o:hr="t" fillcolor="#a0a0a0" stroked="f"/>
+          <v:rect id="_x0000_i1030" style="width:0;height:1.5pt" o:hralign="center" o:hrstd="t" o:hr="t" fillcolor="#a0a0a0" stroked="f"/>
         </w:pict>
       </w:r>
     </w:p>
@@ -482,7 +482,7 @@
     <w:p>
       <w:r>
         <w:pict w14:anchorId="54485489">
-          <v:rect id="_x0000_i1079" style="width:0;height:1.5pt" o:hralign="center" o:hrstd="t" o:hr="t" fillcolor="#a0a0a0" stroked="f"/>
+          <v:rect id="_x0000_i1031" style="width:0;height:1.5pt" o:hralign="center" o:hrstd="t" o:hr="t" fillcolor="#a0a0a0" stroked="f"/>
         </w:pict>
       </w:r>
     </w:p>
@@ -577,7 +577,1168 @@
     <w:p/>
     <w:p/>
     <w:p/>
-    <w:p/>
+    <w:p>
+      <w:pPr>
+        <w:pStyle w:val="ListParagraph"/>
+        <w:numPr>
+          <w:ilvl w:val="0"/>
+          <w:numId w:val="1"/>
+        </w:numPr>
+      </w:pPr>
+      <w:r>
+        <w:lastRenderedPageBreak/>
+        <w:t xml:space="preserve">Introduction </w:t>
+      </w:r>
+    </w:p>
+    <w:p>
+      <w:pPr>
+        <w:pStyle w:val="ListParagraph"/>
+        <w:numPr>
+          <w:ilvl w:val="0"/>
+          <w:numId w:val="1"/>
+        </w:numPr>
+      </w:pPr>
+      <w:r>
+        <w:t xml:space="preserve">Objectives </w:t>
+      </w:r>
+    </w:p>
+    <w:p>
+      <w:pPr>
+        <w:pStyle w:val="ListParagraph"/>
+        <w:numPr>
+          <w:ilvl w:val="0"/>
+          <w:numId w:val="1"/>
+        </w:numPr>
+      </w:pPr>
+      <w:r>
+        <w:t xml:space="preserve">Technologies Used </w:t>
+      </w:r>
+    </w:p>
+    <w:p>
+      <w:pPr>
+        <w:pStyle w:val="ListParagraph"/>
+        <w:numPr>
+          <w:ilvl w:val="0"/>
+          <w:numId w:val="1"/>
+        </w:numPr>
+      </w:pPr>
+      <w:r>
+        <w:t>AWS Services Used</w:t>
+      </w:r>
+    </w:p>
+    <w:p/>
+    <w:p>
+      <w:pPr>
+        <w:rPr>
+          <w:b/>
+          <w:bCs/>
+        </w:rPr>
+      </w:pPr>
+    </w:p>
+    <w:p>
+      <w:pPr>
+        <w:rPr>
+          <w:b/>
+          <w:bCs/>
+        </w:rPr>
+      </w:pPr>
+      <w:r>
+        <w:rPr>
+          <w:b/>
+          <w:bCs/>
+        </w:rPr>
+        <w:t>INTRODUCTION</w:t>
+      </w:r>
+    </w:p>
+    <w:p>
+      <w:r>
+        <w:t>Cloud computing is widely used for deploying and managing modern IT infrastructure. Manual cloud infrastructure management is time-consuming, error-prone, and difficult to maintain. Infrastructure as Code (</w:t>
+      </w:r>
+      <w:proofErr w:type="spellStart"/>
+      <w:r>
+        <w:t>IaC</w:t>
+      </w:r>
+      <w:proofErr w:type="spellEnd"/>
+      <w:r>
+        <w:t>) is a modern approach that automates infrastructure provisioning using configuration files.</w:t>
+      </w:r>
+    </w:p>
+    <w:p>
+      <w:r>
+        <w:t xml:space="preserve">Terraform is an open-source Infrastructure as Code tool developed by </w:t>
+      </w:r>
+      <w:proofErr w:type="spellStart"/>
+      <w:r>
+        <w:t>HashiCorp</w:t>
+      </w:r>
+      <w:proofErr w:type="spellEnd"/>
+      <w:r>
+        <w:t xml:space="preserve"> that enables automated provisioning and management of cloud infrastructure.</w:t>
+      </w:r>
+    </w:p>
+    <w:p>
+      <w:r>
+        <w:t>This project focuses on automating AWS infrastructure provisioning using Terraform with modular architecture, remote backend configuration using Amazon S3, and state locking using DynamoDB.</w:t>
+      </w:r>
+    </w:p>
+    <w:p>
+      <w:r>
+        <w:t>The project provisions AWS resources such as Virtual Private Cloud (VPC), Subnet, Security Group, and EC2 Instance. The implementation improves infrastructure consistency, scalability, and automation.</w:t>
+      </w:r>
+    </w:p>
+    <w:p/>
+    <w:p>
+      <w:pPr>
+        <w:rPr>
+          <w:b/>
+          <w:bCs/>
+        </w:rPr>
+      </w:pPr>
+      <w:r>
+        <w:rPr>
+          <w:b/>
+          <w:bCs/>
+        </w:rPr>
+        <w:t>OBJECTIVES</w:t>
+      </w:r>
+    </w:p>
+    <w:p>
+      <w:pPr>
+        <w:numPr>
+          <w:ilvl w:val="0"/>
+          <w:numId w:val="3"/>
+        </w:numPr>
+      </w:pPr>
+      <w:r>
+        <w:t>To automate AWS infrastructure provisioning using Terraform</w:t>
+      </w:r>
+    </w:p>
+    <w:p>
+      <w:pPr>
+        <w:numPr>
+          <w:ilvl w:val="0"/>
+          <w:numId w:val="3"/>
+        </w:numPr>
+      </w:pPr>
+      <w:r>
+        <w:t>To implement Infrastructure as Code (</w:t>
+      </w:r>
+      <w:proofErr w:type="spellStart"/>
+      <w:r>
+        <w:t>IaC</w:t>
+      </w:r>
+      <w:proofErr w:type="spellEnd"/>
+      <w:r>
+        <w:t>)</w:t>
+      </w:r>
+    </w:p>
+    <w:p>
+      <w:pPr>
+        <w:numPr>
+          <w:ilvl w:val="0"/>
+          <w:numId w:val="3"/>
+        </w:numPr>
+      </w:pPr>
+      <w:r>
+        <w:t>To configure remote backend using Amazon S3</w:t>
+      </w:r>
+    </w:p>
+    <w:p>
+      <w:pPr>
+        <w:numPr>
+          <w:ilvl w:val="0"/>
+          <w:numId w:val="3"/>
+        </w:numPr>
+      </w:pPr>
+      <w:r>
+        <w:t>To implement state locking using DynamoDB</w:t>
+      </w:r>
+    </w:p>
+    <w:p>
+      <w:pPr>
+        <w:numPr>
+          <w:ilvl w:val="0"/>
+          <w:numId w:val="3"/>
+        </w:numPr>
+      </w:pPr>
+      <w:r>
+        <w:t xml:space="preserve">To create </w:t>
+      </w:r>
+      <w:proofErr w:type="gramStart"/>
+      <w:r>
+        <w:t>reusable</w:t>
+      </w:r>
+      <w:proofErr w:type="gramEnd"/>
+      <w:r>
+        <w:t xml:space="preserve"> Terraform modules</w:t>
+      </w:r>
+    </w:p>
+    <w:p>
+      <w:pPr>
+        <w:numPr>
+          <w:ilvl w:val="0"/>
+          <w:numId w:val="3"/>
+        </w:numPr>
+      </w:pPr>
+      <w:r>
+        <w:t>To reduce manual infrastructure configuration</w:t>
+      </w:r>
+    </w:p>
+    <w:p>
+      <w:pPr>
+        <w:numPr>
+          <w:ilvl w:val="0"/>
+          <w:numId w:val="3"/>
+        </w:numPr>
+      </w:pPr>
+      <w:r>
+        <w:t>To improve infrastructure consistency and automation</w:t>
+      </w:r>
+    </w:p>
+    <w:p/>
+    <w:p/>
+    <w:p/>
+    <w:p/>
+    <w:p/>
+    <w:p/>
+    <w:p/>
+    <w:p>
+      <w:pPr>
+        <w:rPr>
+          <w:b/>
+          <w:bCs/>
+        </w:rPr>
+      </w:pPr>
+      <w:r>
+        <w:rPr>
+          <w:b/>
+          <w:bCs/>
+        </w:rPr>
+        <w:lastRenderedPageBreak/>
+        <w:t>TECHNOLOGIES USED</w:t>
+      </w:r>
+    </w:p>
+    <w:tbl>
+      <w:tblPr>
+        <w:tblW w:w="0" w:type="auto"/>
+        <w:tblCellSpacing w:w="15" w:type="dxa"/>
+        <w:tblCellMar>
+          <w:top w:w="15" w:type="dxa"/>
+          <w:left w:w="15" w:type="dxa"/>
+          <w:bottom w:w="15" w:type="dxa"/>
+          <w:right w:w="15" w:type="dxa"/>
+        </w:tblCellMar>
+        <w:tblLook w:val="04A0" w:firstRow="1" w:lastRow="0" w:firstColumn="1" w:lastColumn="0" w:noHBand="0" w:noVBand="1"/>
+      </w:tblPr>
+      <w:tblGrid>
+        <w:gridCol w:w="1542"/>
+        <w:gridCol w:w="2639"/>
+      </w:tblGrid>
+      <w:tr>
+        <w:trPr>
+          <w:tblHeader/>
+          <w:tblCellSpacing w:w="15" w:type="dxa"/>
+        </w:trPr>
+        <w:tc>
+          <w:tcPr>
+            <w:tcW w:w="0" w:type="auto"/>
+            <w:vAlign w:val="center"/>
+            <w:hideMark/>
+          </w:tcPr>
+          <w:p>
+            <w:pPr>
+              <w:rPr>
+                <w:b/>
+                <w:bCs/>
+              </w:rPr>
+            </w:pPr>
+            <w:r>
+              <w:rPr>
+                <w:b/>
+                <w:bCs/>
+              </w:rPr>
+              <w:t>Technology</w:t>
+            </w:r>
+          </w:p>
+        </w:tc>
+        <w:tc>
+          <w:tcPr>
+            <w:tcW w:w="0" w:type="auto"/>
+            <w:vAlign w:val="center"/>
+            <w:hideMark/>
+          </w:tcPr>
+          <w:p>
+            <w:pPr>
+              <w:rPr>
+                <w:b/>
+                <w:bCs/>
+              </w:rPr>
+            </w:pPr>
+            <w:r>
+              <w:rPr>
+                <w:b/>
+                <w:bCs/>
+              </w:rPr>
+              <w:t>Purpose</w:t>
+            </w:r>
+          </w:p>
+        </w:tc>
+      </w:tr>
+      <w:tr>
+        <w:trPr>
+          <w:tblCellSpacing w:w="15" w:type="dxa"/>
+        </w:trPr>
+        <w:tc>
+          <w:tcPr>
+            <w:tcW w:w="0" w:type="auto"/>
+            <w:vAlign w:val="center"/>
+            <w:hideMark/>
+          </w:tcPr>
+          <w:p>
+            <w:r>
+              <w:t>Terraform</w:t>
+            </w:r>
+          </w:p>
+        </w:tc>
+        <w:tc>
+          <w:tcPr>
+            <w:tcW w:w="0" w:type="auto"/>
+            <w:vAlign w:val="center"/>
+            <w:hideMark/>
+          </w:tcPr>
+          <w:p>
+            <w:r>
+              <w:t>Infrastructure Automation</w:t>
+            </w:r>
+          </w:p>
+        </w:tc>
+      </w:tr>
+      <w:tr>
+        <w:trPr>
+          <w:tblCellSpacing w:w="15" w:type="dxa"/>
+        </w:trPr>
+        <w:tc>
+          <w:tcPr>
+            <w:tcW w:w="0" w:type="auto"/>
+            <w:vAlign w:val="center"/>
+            <w:hideMark/>
+          </w:tcPr>
+          <w:p>
+            <w:r>
+              <w:t>AWS EC2</w:t>
+            </w:r>
+          </w:p>
+        </w:tc>
+        <w:tc>
+          <w:tcPr>
+            <w:tcW w:w="0" w:type="auto"/>
+            <w:vAlign w:val="center"/>
+            <w:hideMark/>
+          </w:tcPr>
+          <w:p>
+            <w:r>
+              <w:t>Virtual Machine Provisioning</w:t>
+            </w:r>
+          </w:p>
+        </w:tc>
+      </w:tr>
+      <w:tr>
+        <w:trPr>
+          <w:tblCellSpacing w:w="15" w:type="dxa"/>
+        </w:trPr>
+        <w:tc>
+          <w:tcPr>
+            <w:tcW w:w="0" w:type="auto"/>
+            <w:vAlign w:val="center"/>
+            <w:hideMark/>
+          </w:tcPr>
+          <w:p>
+            <w:r>
+              <w:t>AWS VPC</w:t>
+            </w:r>
+          </w:p>
+        </w:tc>
+        <w:tc>
+          <w:tcPr>
+            <w:tcW w:w="0" w:type="auto"/>
+            <w:vAlign w:val="center"/>
+            <w:hideMark/>
+          </w:tcPr>
+          <w:p>
+            <w:r>
+              <w:t>Network Infrastructure</w:t>
+            </w:r>
+          </w:p>
+        </w:tc>
+      </w:tr>
+      <w:tr>
+        <w:trPr>
+          <w:tblCellSpacing w:w="15" w:type="dxa"/>
+        </w:trPr>
+        <w:tc>
+          <w:tcPr>
+            <w:tcW w:w="0" w:type="auto"/>
+            <w:vAlign w:val="center"/>
+            <w:hideMark/>
+          </w:tcPr>
+          <w:p>
+            <w:r>
+              <w:t>AWS S3</w:t>
+            </w:r>
+          </w:p>
+        </w:tc>
+        <w:tc>
+          <w:tcPr>
+            <w:tcW w:w="0" w:type="auto"/>
+            <w:vAlign w:val="center"/>
+            <w:hideMark/>
+          </w:tcPr>
+          <w:p>
+            <w:r>
+              <w:t>Remote Backend Storage</w:t>
+            </w:r>
+          </w:p>
+        </w:tc>
+      </w:tr>
+      <w:tr>
+        <w:trPr>
+          <w:tblCellSpacing w:w="15" w:type="dxa"/>
+        </w:trPr>
+        <w:tc>
+          <w:tcPr>
+            <w:tcW w:w="0" w:type="auto"/>
+            <w:vAlign w:val="center"/>
+            <w:hideMark/>
+          </w:tcPr>
+          <w:p>
+            <w:r>
+              <w:t>AWS DynamoDB</w:t>
+            </w:r>
+          </w:p>
+        </w:tc>
+        <w:tc>
+          <w:tcPr>
+            <w:tcW w:w="0" w:type="auto"/>
+            <w:vAlign w:val="center"/>
+            <w:hideMark/>
+          </w:tcPr>
+          <w:p>
+            <w:r>
+              <w:t>State Locking</w:t>
+            </w:r>
+          </w:p>
+        </w:tc>
+      </w:tr>
+      <w:tr>
+        <w:trPr>
+          <w:tblCellSpacing w:w="15" w:type="dxa"/>
+        </w:trPr>
+        <w:tc>
+          <w:tcPr>
+            <w:tcW w:w="0" w:type="auto"/>
+            <w:vAlign w:val="center"/>
+            <w:hideMark/>
+          </w:tcPr>
+          <w:p>
+            <w:r>
+              <w:t>GitHub</w:t>
+            </w:r>
+          </w:p>
+        </w:tc>
+        <w:tc>
+          <w:tcPr>
+            <w:tcW w:w="0" w:type="auto"/>
+            <w:vAlign w:val="center"/>
+            <w:hideMark/>
+          </w:tcPr>
+          <w:p>
+            <w:r>
+              <w:t>Version Control</w:t>
+            </w:r>
+          </w:p>
+        </w:tc>
+      </w:tr>
+      <w:tr>
+        <w:trPr>
+          <w:tblCellSpacing w:w="15" w:type="dxa"/>
+        </w:trPr>
+        <w:tc>
+          <w:tcPr>
+            <w:tcW w:w="0" w:type="auto"/>
+            <w:vAlign w:val="center"/>
+            <w:hideMark/>
+          </w:tcPr>
+          <w:p>
+            <w:r>
+              <w:t>VS Code</w:t>
+            </w:r>
+          </w:p>
+        </w:tc>
+        <w:tc>
+          <w:tcPr>
+            <w:tcW w:w="0" w:type="auto"/>
+            <w:vAlign w:val="center"/>
+            <w:hideMark/>
+          </w:tcPr>
+          <w:p>
+            <w:r>
+              <w:t>Development Environment</w:t>
+            </w:r>
+          </w:p>
+        </w:tc>
+      </w:tr>
+      <w:tr>
+        <w:trPr>
+          <w:tblCellSpacing w:w="15" w:type="dxa"/>
+        </w:trPr>
+        <w:tc>
+          <w:tcPr>
+            <w:tcW w:w="0" w:type="auto"/>
+            <w:vAlign w:val="center"/>
+            <w:hideMark/>
+          </w:tcPr>
+          <w:p>
+            <w:r>
+              <w:t>AWS CLI</w:t>
+            </w:r>
+          </w:p>
+        </w:tc>
+        <w:tc>
+          <w:tcPr>
+            <w:tcW w:w="0" w:type="auto"/>
+            <w:vAlign w:val="center"/>
+            <w:hideMark/>
+          </w:tcPr>
+          <w:p>
+            <w:r>
+              <w:t>AWS Configuration</w:t>
+            </w:r>
+          </w:p>
+        </w:tc>
+      </w:tr>
+    </w:tbl>
+    <w:p/>
+    <w:p>
+      <w:pPr>
+        <w:rPr>
+          <w:b/>
+          <w:bCs/>
+        </w:rPr>
+      </w:pPr>
+      <w:r>
+        <w:rPr>
+          <w:b/>
+          <w:bCs/>
+        </w:rPr>
+        <w:t>AWS SERVICES USED</w:t>
+      </w:r>
+    </w:p>
+    <w:p>
+      <w:pPr>
+        <w:rPr>
+          <w:b/>
+          <w:bCs/>
+        </w:rPr>
+      </w:pPr>
+      <w:r>
+        <w:rPr>
+          <w:b/>
+          <w:bCs/>
+        </w:rPr>
+        <w:t>Amazon EC2</w:t>
+      </w:r>
+    </w:p>
+    <w:p>
+      <w:r>
+        <w:t>Used to provision virtual servers in AWS cloud.</w:t>
+      </w:r>
+    </w:p>
+    <w:p>
+      <w:pPr>
+        <w:rPr>
+          <w:b/>
+          <w:bCs/>
+        </w:rPr>
+      </w:pPr>
+      <w:r>
+        <w:rPr>
+          <w:b/>
+          <w:bCs/>
+        </w:rPr>
+        <w:t>Amazon VPC</w:t>
+      </w:r>
+    </w:p>
+    <w:p>
+      <w:r>
+        <w:t>Used to create isolated cloud network infrastructure.</w:t>
+      </w:r>
+    </w:p>
+    <w:p>
+      <w:pPr>
+        <w:rPr>
+          <w:b/>
+          <w:bCs/>
+        </w:rPr>
+      </w:pPr>
+      <w:r>
+        <w:rPr>
+          <w:b/>
+          <w:bCs/>
+        </w:rPr>
+        <w:t>Amazon S3</w:t>
+      </w:r>
+    </w:p>
+    <w:p>
+      <w:r>
+        <w:t>Used as remote backend for Terraform state management.</w:t>
+      </w:r>
+    </w:p>
+    <w:p>
+      <w:pPr>
+        <w:rPr>
+          <w:b/>
+          <w:bCs/>
+        </w:rPr>
+      </w:pPr>
+      <w:r>
+        <w:rPr>
+          <w:b/>
+          <w:bCs/>
+        </w:rPr>
+        <w:t>Amazon DynamoDB</w:t>
+      </w:r>
+    </w:p>
+    <w:p>
+      <w:r>
+        <w:t>Used for Terraform state locking to prevent concurrent modifications.</w:t>
+      </w:r>
+    </w:p>
+    <w:p>
+      <w:pPr>
+        <w:rPr>
+          <w:b/>
+          <w:bCs/>
+        </w:rPr>
+      </w:pPr>
+      <w:r>
+        <w:rPr>
+          <w:b/>
+          <w:bCs/>
+        </w:rPr>
+        <w:t>Security Group</w:t>
+      </w:r>
+    </w:p>
+    <w:p>
+      <w:r>
+        <w:t>Used to control inbound and outbound traffic for EC2 instances.</w:t>
+      </w:r>
+    </w:p>
+    <w:p/>
+    <w:p/>
+    <w:p/>
+    <w:p/>
+    <w:p/>
+    <w:p/>
+    <w:p>
+      <w:pPr>
+        <w:rPr>
+          <w:b/>
+          <w:bCs/>
+          <w:noProof/>
+        </w:rPr>
+      </w:pPr>
+    </w:p>
+    <w:p>
+      <w:pPr>
+        <w:rPr>
+          <w:b/>
+          <w:bCs/>
+          <w:noProof/>
+        </w:rPr>
+      </w:pPr>
+    </w:p>
+    <w:p>
+      <w:pPr>
+        <w:rPr>
+          <w:b/>
+          <w:bCs/>
+          <w:noProof/>
+        </w:rPr>
+      </w:pPr>
+      <w:r>
+        <w:rPr>
+          <w:b/>
+          <w:bCs/>
+          <w:noProof/>
+        </w:rPr>
+        <w:lastRenderedPageBreak/>
+        <w:t>EC2</w:t>
+      </w:r>
+      <w:r>
+        <w:rPr>
+          <w:b/>
+          <w:bCs/>
+          <w:noProof/>
+        </w:rPr>
+        <w:tab/>
+      </w:r>
+    </w:p>
+    <w:p>
+      <w:pPr>
+        <w:rPr>
+          <w:b/>
+          <w:bCs/>
+          <w:noProof/>
+        </w:rPr>
+      </w:pPr>
+      <w:r>
+        <w:rPr>
+          <w:b/>
+          <w:bCs/>
+          <w:noProof/>
+        </w:rPr>
+        <w:tab/>
+      </w:r>
+      <w:r>
+        <w:rPr>
+          <w:b/>
+          <w:bCs/>
+          <w:noProof/>
+        </w:rPr>
+        <w:tab/>
+      </w:r>
+      <w:r>
+        <w:rPr>
+          <w:b/>
+          <w:bCs/>
+          <w:noProof/>
+        </w:rPr>
+        <w:tab/>
+      </w:r>
+      <w:r>
+        <w:rPr>
+          <w:b/>
+          <w:bCs/>
+          <w:noProof/>
+        </w:rPr>
+        <w:tab/>
+      </w:r>
+      <w:r>
+        <w:rPr>
+          <w:b/>
+          <w:bCs/>
+          <w:noProof/>
+        </w:rPr>
+        <w:tab/>
+      </w:r>
+      <w:r>
+        <w:rPr>
+          <w:b/>
+          <w:bCs/>
+          <w:noProof/>
+        </w:rPr>
+        <w:tab/>
+      </w:r>
+      <w:r>
+        <w:rPr>
+          <w:b/>
+          <w:bCs/>
+          <w:noProof/>
+        </w:rPr>
+        <w:tab/>
+      </w:r>
+      <w:r>
+        <w:rPr>
+          <w:b/>
+          <w:bCs/>
+          <w:noProof/>
+        </w:rPr>
+        <w:tab/>
+      </w:r>
+      <w:r>
+        <w:rPr>
+          <w:b/>
+          <w:bCs/>
+          <w:noProof/>
+        </w:rPr>
+        <w:tab/>
+      </w:r>
+      <w:r>
+        <w:rPr>
+          <w:b/>
+          <w:bCs/>
+          <w:noProof/>
+        </w:rPr>
+        <w:tab/>
+      </w:r>
+      <w:r>
+        <w:rPr>
+          <w:b/>
+          <w:bCs/>
+          <w:noProof/>
+        </w:rPr>
+        <w:tab/>
+      </w:r>
+    </w:p>
+    <w:p>
+      <w:r>
+        <w:rPr>
+          <w:noProof/>
+        </w:rPr>
+        <w:drawing>
+          <wp:inline distT="0" distB="0" distL="0" distR="0" wp14:anchorId="6965A390" wp14:editId="459C2E8F">
+            <wp:extent cx="5731510" cy="2621280"/>
+            <wp:effectExtent l="0" t="0" r="2540" b="7620"/>
+            <wp:docPr id="818400968" name="Picture 5"/>
+            <wp:cNvGraphicFramePr>
+              <a:graphicFrameLocks xmlns:a="http://schemas.openxmlformats.org/drawingml/2006/main" noChangeAspect="1"/>
+            </wp:cNvGraphicFramePr>
+            <a:graphic xmlns:a="http://schemas.openxmlformats.org/drawingml/2006/main">
+              <a:graphicData uri="http://schemas.openxmlformats.org/drawingml/2006/picture">
+                <pic:pic xmlns:pic="http://schemas.openxmlformats.org/drawingml/2006/picture">
+                  <pic:nvPicPr>
+                    <pic:cNvPr id="818400968" name="Picture 818400968"/>
+                    <pic:cNvPicPr/>
+                  </pic:nvPicPr>
+                  <pic:blipFill>
+                    <a:blip r:embed="rId7" cstate="print">
+                      <a:extLst>
+                        <a:ext uri="{28A0092B-C50C-407E-A947-70E740481C1C}">
+                          <a14:useLocalDpi xmlns:a14="http://schemas.microsoft.com/office/drawing/2010/main" val="0"/>
+                        </a:ext>
+                      </a:extLst>
+                    </a:blip>
+                    <a:stretch>
+                      <a:fillRect/>
+                    </a:stretch>
+                  </pic:blipFill>
+                  <pic:spPr>
+                    <a:xfrm>
+                      <a:off x="0" y="0"/>
+                      <a:ext cx="5731510" cy="2621280"/>
+                    </a:xfrm>
+                    <a:prstGeom prst="rect">
+                      <a:avLst/>
+                    </a:prstGeom>
+                  </pic:spPr>
+                </pic:pic>
+              </a:graphicData>
+            </a:graphic>
+          </wp:inline>
+        </w:drawing>
+      </w:r>
+    </w:p>
+    <w:p/>
+    <w:p>
+      <w:pPr>
+        <w:rPr>
+          <w:b/>
+          <w:bCs/>
+        </w:rPr>
+      </w:pPr>
+    </w:p>
+    <w:p>
+      <w:pPr>
+        <w:rPr>
+          <w:b/>
+          <w:bCs/>
+        </w:rPr>
+      </w:pPr>
+    </w:p>
+    <w:p>
+      <w:pPr>
+        <w:rPr>
+          <w:b/>
+          <w:bCs/>
+        </w:rPr>
+      </w:pPr>
+      <w:r>
+        <w:rPr>
+          <w:b/>
+          <w:bCs/>
+        </w:rPr>
+        <w:t>VPC</w:t>
+      </w:r>
+    </w:p>
+    <w:p>
+      <w:pPr>
+        <w:rPr>
+          <w:b/>
+          <w:bCs/>
+        </w:rPr>
+      </w:pPr>
+    </w:p>
+    <w:p>
+      <w:pPr>
+        <w:rPr>
+          <w:b/>
+          <w:bCs/>
+        </w:rPr>
+      </w:pPr>
+      <w:r>
+        <w:rPr>
+          <w:b/>
+          <w:bCs/>
+          <w:noProof/>
+        </w:rPr>
+        <w:drawing>
+          <wp:inline distT="0" distB="0" distL="0" distR="0" wp14:anchorId="614F2768" wp14:editId="47A5FB08">
+            <wp:extent cx="5731510" cy="2578735"/>
+            <wp:effectExtent l="0" t="0" r="2540" b="0"/>
+            <wp:docPr id="1379152077" name="Picture 6"/>
+            <wp:cNvGraphicFramePr>
+              <a:graphicFrameLocks xmlns:a="http://schemas.openxmlformats.org/drawingml/2006/main" noChangeAspect="1"/>
+            </wp:cNvGraphicFramePr>
+            <a:graphic xmlns:a="http://schemas.openxmlformats.org/drawingml/2006/main">
+              <a:graphicData uri="http://schemas.openxmlformats.org/drawingml/2006/picture">
+                <pic:pic xmlns:pic="http://schemas.openxmlformats.org/drawingml/2006/picture">
+                  <pic:nvPicPr>
+                    <pic:cNvPr id="1379152077" name="Picture 1379152077"/>
+                    <pic:cNvPicPr/>
+                  </pic:nvPicPr>
+                  <pic:blipFill>
+                    <a:blip r:embed="rId8" cstate="print">
+                      <a:extLst>
+                        <a:ext uri="{28A0092B-C50C-407E-A947-70E740481C1C}">
+                          <a14:useLocalDpi xmlns:a14="http://schemas.microsoft.com/office/drawing/2010/main" val="0"/>
+                        </a:ext>
+                      </a:extLst>
+                    </a:blip>
+                    <a:stretch>
+                      <a:fillRect/>
+                    </a:stretch>
+                  </pic:blipFill>
+                  <pic:spPr>
+                    <a:xfrm>
+                      <a:off x="0" y="0"/>
+                      <a:ext cx="5731510" cy="2578735"/>
+                    </a:xfrm>
+                    <a:prstGeom prst="rect">
+                      <a:avLst/>
+                    </a:prstGeom>
+                  </pic:spPr>
+                </pic:pic>
+              </a:graphicData>
+            </a:graphic>
+          </wp:inline>
+        </w:drawing>
+      </w:r>
+    </w:p>
+    <w:p>
+      <w:pPr>
+        <w:rPr>
+          <w:b/>
+          <w:bCs/>
+        </w:rPr>
+      </w:pPr>
+    </w:p>
+    <w:p>
+      <w:pPr>
+        <w:rPr>
+          <w:b/>
+          <w:bCs/>
+        </w:rPr>
+      </w:pPr>
+    </w:p>
+    <w:p>
+      <w:pPr>
+        <w:rPr>
+          <w:b/>
+          <w:bCs/>
+        </w:rPr>
+      </w:pPr>
+    </w:p>
+    <w:p>
+      <w:pPr>
+        <w:rPr>
+          <w:b/>
+          <w:bCs/>
+        </w:rPr>
+      </w:pPr>
+    </w:p>
+    <w:p>
+      <w:pPr>
+        <w:rPr>
+          <w:b/>
+          <w:bCs/>
+        </w:rPr>
+      </w:pPr>
+    </w:p>
+    <w:p>
+      <w:pPr>
+        <w:rPr>
+          <w:b/>
+          <w:bCs/>
+        </w:rPr>
+      </w:pPr>
+      <w:r>
+        <w:rPr>
+          <w:b/>
+          <w:bCs/>
+        </w:rPr>
+        <w:lastRenderedPageBreak/>
+        <w:t>S3</w:t>
+      </w:r>
+    </w:p>
+    <w:p>
+      <w:pPr>
+        <w:rPr>
+          <w:b/>
+          <w:bCs/>
+        </w:rPr>
+      </w:pPr>
+    </w:p>
+    <w:p>
+      <w:pPr>
+        <w:rPr>
+          <w:b/>
+          <w:bCs/>
+        </w:rPr>
+      </w:pPr>
+      <w:r>
+        <w:rPr>
+          <w:b/>
+          <w:bCs/>
+          <w:noProof/>
+        </w:rPr>
+        <w:drawing>
+          <wp:inline distT="0" distB="0" distL="0" distR="0" wp14:anchorId="70AF7499" wp14:editId="3B4B025A">
+            <wp:extent cx="5731510" cy="2581275"/>
+            <wp:effectExtent l="0" t="0" r="2540" b="9525"/>
+            <wp:docPr id="328677267" name="Picture 7"/>
+            <wp:cNvGraphicFramePr>
+              <a:graphicFrameLocks xmlns:a="http://schemas.openxmlformats.org/drawingml/2006/main" noChangeAspect="1"/>
+            </wp:cNvGraphicFramePr>
+            <a:graphic xmlns:a="http://schemas.openxmlformats.org/drawingml/2006/main">
+              <a:graphicData uri="http://schemas.openxmlformats.org/drawingml/2006/picture">
+                <pic:pic xmlns:pic="http://schemas.openxmlformats.org/drawingml/2006/picture">
+                  <pic:nvPicPr>
+                    <pic:cNvPr id="328677267" name="Picture 328677267"/>
+                    <pic:cNvPicPr/>
+                  </pic:nvPicPr>
+                  <pic:blipFill>
+                    <a:blip r:embed="rId9" cstate="print">
+                      <a:extLst>
+                        <a:ext uri="{28A0092B-C50C-407E-A947-70E740481C1C}">
+                          <a14:useLocalDpi xmlns:a14="http://schemas.microsoft.com/office/drawing/2010/main" val="0"/>
+                        </a:ext>
+                      </a:extLst>
+                    </a:blip>
+                    <a:stretch>
+                      <a:fillRect/>
+                    </a:stretch>
+                  </pic:blipFill>
+                  <pic:spPr>
+                    <a:xfrm>
+                      <a:off x="0" y="0"/>
+                      <a:ext cx="5731510" cy="2581275"/>
+                    </a:xfrm>
+                    <a:prstGeom prst="rect">
+                      <a:avLst/>
+                    </a:prstGeom>
+                  </pic:spPr>
+                </pic:pic>
+              </a:graphicData>
+            </a:graphic>
+          </wp:inline>
+        </w:drawing>
+      </w:r>
+    </w:p>
+    <w:p>
+      <w:pPr>
+        <w:rPr>
+          <w:b/>
+          <w:bCs/>
+        </w:rPr>
+      </w:pPr>
+    </w:p>
+    <w:p>
+      <w:pPr>
+        <w:rPr>
+          <w:b/>
+          <w:bCs/>
+        </w:rPr>
+      </w:pPr>
+    </w:p>
+    <w:p>
+      <w:pPr>
+        <w:rPr>
+          <w:b/>
+          <w:bCs/>
+        </w:rPr>
+      </w:pPr>
+      <w:r>
+        <w:rPr>
+          <w:b/>
+          <w:bCs/>
+        </w:rPr>
+        <w:t xml:space="preserve">DYNAMO DB </w:t>
+      </w:r>
+    </w:p>
+    <w:p>
+      <w:pPr>
+        <w:rPr>
+          <w:b/>
+          <w:bCs/>
+        </w:rPr>
+      </w:pPr>
+    </w:p>
+    <w:p>
+      <w:pPr>
+        <w:rPr>
+          <w:b/>
+          <w:bCs/>
+        </w:rPr>
+      </w:pPr>
+      <w:r>
+        <w:rPr>
+          <w:b/>
+          <w:bCs/>
+          <w:noProof/>
+        </w:rPr>
+        <w:drawing>
+          <wp:inline distT="0" distB="0" distL="0" distR="0" wp14:anchorId="2C4B6732" wp14:editId="256F5635">
+            <wp:extent cx="5731510" cy="2544445"/>
+            <wp:effectExtent l="0" t="0" r="2540" b="8255"/>
+            <wp:docPr id="615609533" name="Picture 8"/>
+            <wp:cNvGraphicFramePr>
+              <a:graphicFrameLocks xmlns:a="http://schemas.openxmlformats.org/drawingml/2006/main" noChangeAspect="1"/>
+            </wp:cNvGraphicFramePr>
+            <a:graphic xmlns:a="http://schemas.openxmlformats.org/drawingml/2006/main">
+              <a:graphicData uri="http://schemas.openxmlformats.org/drawingml/2006/picture">
+                <pic:pic xmlns:pic="http://schemas.openxmlformats.org/drawingml/2006/picture">
+                  <pic:nvPicPr>
+                    <pic:cNvPr id="615609533" name="Picture 615609533"/>
+                    <pic:cNvPicPr/>
+                  </pic:nvPicPr>
+                  <pic:blipFill>
+                    <a:blip r:embed="rId10" cstate="print">
+                      <a:extLst>
+                        <a:ext uri="{28A0092B-C50C-407E-A947-70E740481C1C}">
+                          <a14:useLocalDpi xmlns:a14="http://schemas.microsoft.com/office/drawing/2010/main" val="0"/>
+                        </a:ext>
+                      </a:extLst>
+                    </a:blip>
+                    <a:stretch>
+                      <a:fillRect/>
+                    </a:stretch>
+                  </pic:blipFill>
+                  <pic:spPr>
+                    <a:xfrm>
+                      <a:off x="0" y="0"/>
+                      <a:ext cx="5731510" cy="2544445"/>
+                    </a:xfrm>
+                    <a:prstGeom prst="rect">
+                      <a:avLst/>
+                    </a:prstGeom>
+                  </pic:spPr>
+                </pic:pic>
+              </a:graphicData>
+            </a:graphic>
+          </wp:inline>
+        </w:drawing>
+      </w:r>
+    </w:p>
     <w:sectPr>
       <w:pgSz w:w="11906" w:h="16838"/>
       <w:pgMar w:top="1440" w:right="1440" w:bottom="1440" w:left="1440" w:header="708" w:footer="708" w:gutter="0"/>
@@ -586,6 +1747,444 @@
     </w:sectPr>
   </w:body>
 </w:document>
+</file>
+
+<file path=word/endnotes.xml><?xml version="1.0" encoding="utf-8"?>
+<w:endnotes xmlns:wpc="http://schemas.microsoft.com/office/word/2010/wordprocessingCanvas" xmlns:cx="http://schemas.microsoft.com/office/drawing/2014/chartex" xmlns:cx1="http://schemas.microsoft.com/office/drawing/2015/9/8/chartex" xmlns:cx2="http://schemas.microsoft.com/office/drawing/2015/10/21/chartex" xmlns:cx3="http://schemas.microsoft.com/office/drawing/2016/5/9/chartex" xmlns:cx4="http://schemas.microsoft.com/office/drawing/2016/5/10/chartex" xmlns:cx5="http://schemas.microsoft.com/office/drawing/2016/5/11/chartex" xmlns:cx6="http://schemas.microsoft.com/office/drawing/2016/5/12/chartex" xmlns:cx7="http://schemas.microsoft.com/office/drawing/2016/5/13/chartex" xmlns:cx8="http://schemas.microsoft.com/office/drawing/2016/5/14/chartex" xmlns:mc="http://schemas.openxmlformats.org/markup-compatibility/2006" xmlns:aink="http://schemas.microsoft.com/office/drawing/2016/ink" xmlns:am3d="http://schemas.microsoft.com/office/drawing/2017/model3d" xmlns:o="urn:schemas-microsoft-com:office:office" xmlns:oel="http://schemas.microsoft.com/office/2019/extlst" xmlns:r="http://schemas.openxmlformats.org/officeDocument/2006/relationships" xmlns:m="http://schemas.openxmlformats.org/officeDocument/2006/math" xmlns:v="urn:schemas-microsoft-com:vml" xmlns:wp14="http://schemas.microsoft.com/office/word/2010/wordprocessingDrawing" xmlns:wp="http://schemas.openxmlformats.org/drawingml/2006/wordprocessingDrawing" xmlns:w10="urn:schemas-microsoft-com:office:word" xmlns:w="http://schemas.openxmlformats.org/wordprocessingml/2006/main" xmlns:w14="http://schemas.microsoft.com/office/word/2010/wordml" xmlns:w15="http://schemas.microsoft.com/office/word/2012/wordml" xmlns:w16cex="http://schemas.microsoft.com/office/word/2018/wordml/cex" xmlns:w16cid="http://schemas.microsoft.com/office/word/2016/wordml/cid" xmlns:w16="http://schemas.microsoft.com/office/word/2018/wordml" xmlns:w16du="http://schemas.microsoft.com/office/word/2023/wordml/word16du" xmlns:w16sdtdh="http://schemas.microsoft.com/office/word/2020/wordml/sdtdatahash" xmlns:w16sdtfl="http://schemas.microsoft.com/office/word/2024/wordml/sdtformatlock" xmlns:w16se="http://schemas.microsoft.com/office/word/2015/wordml/symex" xmlns:wpg="http://schemas.microsoft.com/office/word/2010/wordprocessingGroup" xmlns:wpi="http://schemas.microsoft.com/office/word/2010/wordprocessingInk" xmlns:wne="http://schemas.microsoft.com/office/word/2006/wordml" xmlns:wps="http://schemas.microsoft.com/office/word/2010/wordprocessingShape" mc:Ignorable="w14 w15 w16se w16cid w16 w16cex w16sdtdh w16sdtfl w16du wp14">
+  <w:endnote w:type="separator" w:id="-1">
+    <w:p>
+      <w:pPr>
+        <w:spacing w:after="0" w:line="240" w:lineRule="auto"/>
+      </w:pPr>
+      <w:r>
+        <w:separator/>
+      </w:r>
+    </w:p>
+  </w:endnote>
+  <w:endnote w:type="continuationSeparator" w:id="0">
+    <w:p>
+      <w:pPr>
+        <w:spacing w:after="0" w:line="240" w:lineRule="auto"/>
+      </w:pPr>
+      <w:r>
+        <w:continuationSeparator/>
+      </w:r>
+    </w:p>
+  </w:endnote>
+</w:endnotes>
+</file>
+
+<file path=word/footnotes.xml><?xml version="1.0" encoding="utf-8"?>
+<w:footnotes xmlns:wpc="http://schemas.microsoft.com/office/word/2010/wordprocessingCanvas" xmlns:cx="http://schemas.microsoft.com/office/drawing/2014/chartex" xmlns:cx1="http://schemas.microsoft.com/office/drawing/2015/9/8/chartex" xmlns:cx2="http://schemas.microsoft.com/office/drawing/2015/10/21/chartex" xmlns:cx3="http://schemas.microsoft.com/office/drawing/2016/5/9/chartex" xmlns:cx4="http://schemas.microsoft.com/office/drawing/2016/5/10/chartex" xmlns:cx5="http://schemas.microsoft.com/office/drawing/2016/5/11/chartex" xmlns:cx6="http://schemas.microsoft.com/office/drawing/2016/5/12/chartex" xmlns:cx7="http://schemas.microsoft.com/office/drawing/2016/5/13/chartex" xmlns:cx8="http://schemas.microsoft.com/office/drawing/2016/5/14/chartex" xmlns:mc="http://schemas.openxmlformats.org/markup-compatibility/2006" xmlns:aink="http://schemas.microsoft.com/office/drawing/2016/ink" xmlns:am3d="http://schemas.microsoft.com/office/drawing/2017/model3d" xmlns:o="urn:schemas-microsoft-com:office:office" xmlns:oel="http://schemas.microsoft.com/office/2019/extlst" xmlns:r="http://schemas.openxmlformats.org/officeDocument/2006/relationships" xmlns:m="http://schemas.openxmlformats.org/officeDocument/2006/math" xmlns:v="urn:schemas-microsoft-com:vml" xmlns:wp14="http://schemas.microsoft.com/office/word/2010/wordprocessingDrawing" xmlns:wp="http://schemas.openxmlformats.org/drawingml/2006/wordprocessingDrawing" xmlns:w10="urn:schemas-microsoft-com:office:word" xmlns:w="http://schemas.openxmlformats.org/wordprocessingml/2006/main" xmlns:w14="http://schemas.microsoft.com/office/word/2010/wordml" xmlns:w15="http://schemas.microsoft.com/office/word/2012/wordml" xmlns:w16cex="http://schemas.microsoft.com/office/word/2018/wordml/cex" xmlns:w16cid="http://schemas.microsoft.com/office/word/2016/wordml/cid" xmlns:w16="http://schemas.microsoft.com/office/word/2018/wordml" xmlns:w16du="http://schemas.microsoft.com/office/word/2023/wordml/word16du" xmlns:w16sdtdh="http://schemas.microsoft.com/office/word/2020/wordml/sdtdatahash" xmlns:w16sdtfl="http://schemas.microsoft.com/office/word/2024/wordml/sdtformatlock" xmlns:w16se="http://schemas.microsoft.com/office/word/2015/wordml/symex" xmlns:wpg="http://schemas.microsoft.com/office/word/2010/wordprocessingGroup" xmlns:wpi="http://schemas.microsoft.com/office/word/2010/wordprocessingInk" xmlns:wne="http://schemas.microsoft.com/office/word/2006/wordml" xmlns:wps="http://schemas.microsoft.com/office/word/2010/wordprocessingShape" mc:Ignorable="w14 w15 w16se w16cid w16 w16cex w16sdtdh w16sdtfl w16du wp14">
+  <w:footnote w:type="separator" w:id="-1">
+    <w:p>
+      <w:pPr>
+        <w:spacing w:after="0" w:line="240" w:lineRule="auto"/>
+      </w:pPr>
+      <w:r>
+        <w:separator/>
+      </w:r>
+    </w:p>
+  </w:footnote>
+  <w:footnote w:type="continuationSeparator" w:id="0">
+    <w:p>
+      <w:pPr>
+        <w:spacing w:after="0" w:line="240" w:lineRule="auto"/>
+      </w:pPr>
+      <w:r>
+        <w:continuationSeparator/>
+      </w:r>
+    </w:p>
+  </w:footnote>
+</w:footnotes>
+</file>
+
+<file path=word/numbering.xml><?xml version="1.0" encoding="utf-8"?>
+<w:numbering xmlns:wpc="http://schemas.microsoft.com/office/word/2010/wordprocessingCanvas" xmlns:cx="http://schemas.microsoft.com/office/drawing/2014/chartex" xmlns:cx1="http://schemas.microsoft.com/office/drawing/2015/9/8/chartex" xmlns:cx2="http://schemas.microsoft.com/office/drawing/2015/10/21/chartex" xmlns:cx3="http://schemas.microsoft.com/office/drawing/2016/5/9/chartex" xmlns:cx4="http://schemas.microsoft.com/office/drawing/2016/5/10/chartex" xmlns:cx5="http://schemas.microsoft.com/office/drawing/2016/5/11/chartex" xmlns:cx6="http://schemas.microsoft.com/office/drawing/2016/5/12/chartex" xmlns:cx7="http://schemas.microsoft.com/office/drawing/2016/5/13/chartex" xmlns:cx8="http://schemas.microsoft.com/office/drawing/2016/5/14/chartex" xmlns:mc="http://schemas.openxmlformats.org/markup-compatibility/2006" xmlns:aink="http://schemas.microsoft.com/office/drawing/2016/ink" xmlns:am3d="http://schemas.microsoft.com/office/drawing/2017/model3d" xmlns:o="urn:schemas-microsoft-com:office:office" xmlns:oel="http://schemas.microsoft.com/office/2019/extlst" xmlns:r="http://schemas.openxmlformats.org/officeDocument/2006/relationships" xmlns:m="http://schemas.openxmlformats.org/officeDocument/2006/math" xmlns:v="urn:schemas-microsoft-com:vml" xmlns:wp14="http://schemas.microsoft.com/office/word/2010/wordprocessingDrawing" xmlns:wp="http://schemas.openxmlformats.org/drawingml/2006/wordprocessingDrawing" xmlns:w10="urn:schemas-microsoft-com:office:word" xmlns:w="http://schemas.openxmlformats.org/wordprocessingml/2006/main" xmlns:w14="http://schemas.microsoft.com/office/word/2010/wordml" xmlns:w15="http://schemas.microsoft.com/office/word/2012/wordml" xmlns:w16cex="http://schemas.microsoft.com/office/word/2018/wordml/cex" xmlns:w16cid="http://schemas.microsoft.com/office/word/2016/wordml/cid" xmlns:w16="http://schemas.microsoft.com/office/word/2018/wordml" xmlns:w16du="http://schemas.microsoft.com/office/word/2023/wordml/word16du" xmlns:w16sdtdh="http://schemas.microsoft.com/office/word/2020/wordml/sdtdatahash" xmlns:w16sdtfl="http://schemas.microsoft.com/office/word/2024/wordml/sdtformatlock" xmlns:w16se="http://schemas.microsoft.com/office/word/2015/wordml/symex" xmlns:wpg="http://schemas.microsoft.com/office/word/2010/wordprocessingGroup" xmlns:wpi="http://schemas.microsoft.com/office/word/2010/wordprocessingInk" xmlns:wne="http://schemas.microsoft.com/office/word/2006/wordml" xmlns:wps="http://schemas.microsoft.com/office/word/2010/wordprocessingShape" mc:Ignorable="w14 w15 w16se w16cid w16 w16cex w16sdtdh w16sdtfl w16du wp14">
+  <w:abstractNum w:abstractNumId="0" w15:restartNumberingAfterBreak="0">
+    <w:nsid w:val="1A3B087A"/>
+    <w:multiLevelType w:val="hybridMultilevel"/>
+    <w:tmpl w:val="E3C81D5A"/>
+    <w:lvl w:ilvl="0" w:tplc="40090001">
+      <w:start w:val="1"/>
+      <w:numFmt w:val="bullet"/>
+      <w:lvlText w:val=""/>
+      <w:lvlJc w:val="left"/>
+      <w:pPr>
+        <w:ind w:left="720" w:hanging="360"/>
+      </w:pPr>
+      <w:rPr>
+        <w:rFonts w:ascii="Symbol" w:hAnsi="Symbol" w:hint="default"/>
+      </w:rPr>
+    </w:lvl>
+    <w:lvl w:ilvl="1" w:tplc="40090003" w:tentative="1">
+      <w:start w:val="1"/>
+      <w:numFmt w:val="bullet"/>
+      <w:lvlText w:val="o"/>
+      <w:lvlJc w:val="left"/>
+      <w:pPr>
+        <w:ind w:left="1440" w:hanging="360"/>
+      </w:pPr>
+      <w:rPr>
+        <w:rFonts w:ascii="Courier New" w:hAnsi="Courier New" w:cs="Courier New" w:hint="default"/>
+      </w:rPr>
+    </w:lvl>
+    <w:lvl w:ilvl="2" w:tplc="40090005" w:tentative="1">
+      <w:start w:val="1"/>
+      <w:numFmt w:val="bullet"/>
+      <w:lvlText w:val=""/>
+      <w:lvlJc w:val="left"/>
+      <w:pPr>
+        <w:ind w:left="2160" w:hanging="360"/>
+      </w:pPr>
+      <w:rPr>
+        <w:rFonts w:ascii="Wingdings" w:hAnsi="Wingdings" w:hint="default"/>
+      </w:rPr>
+    </w:lvl>
+    <w:lvl w:ilvl="3" w:tplc="40090001" w:tentative="1">
+      <w:start w:val="1"/>
+      <w:numFmt w:val="bullet"/>
+      <w:lvlText w:val=""/>
+      <w:lvlJc w:val="left"/>
+      <w:pPr>
+        <w:ind w:left="2880" w:hanging="360"/>
+      </w:pPr>
+      <w:rPr>
+        <w:rFonts w:ascii="Symbol" w:hAnsi="Symbol" w:hint="default"/>
+      </w:rPr>
+    </w:lvl>
+    <w:lvl w:ilvl="4" w:tplc="40090003" w:tentative="1">
+      <w:start w:val="1"/>
+      <w:numFmt w:val="bullet"/>
+      <w:lvlText w:val="o"/>
+      <w:lvlJc w:val="left"/>
+      <w:pPr>
+        <w:ind w:left="3600" w:hanging="360"/>
+      </w:pPr>
+      <w:rPr>
+        <w:rFonts w:ascii="Courier New" w:hAnsi="Courier New" w:cs="Courier New" w:hint="default"/>
+      </w:rPr>
+    </w:lvl>
+    <w:lvl w:ilvl="5" w:tplc="40090005" w:tentative="1">
+      <w:start w:val="1"/>
+      <w:numFmt w:val="bullet"/>
+      <w:lvlText w:val=""/>
+      <w:lvlJc w:val="left"/>
+      <w:pPr>
+        <w:ind w:left="4320" w:hanging="360"/>
+      </w:pPr>
+      <w:rPr>
+        <w:rFonts w:ascii="Wingdings" w:hAnsi="Wingdings" w:hint="default"/>
+      </w:rPr>
+    </w:lvl>
+    <w:lvl w:ilvl="6" w:tplc="40090001" w:tentative="1">
+      <w:start w:val="1"/>
+      <w:numFmt w:val="bullet"/>
+      <w:lvlText w:val=""/>
+      <w:lvlJc w:val="left"/>
+      <w:pPr>
+        <w:ind w:left="5040" w:hanging="360"/>
+      </w:pPr>
+      <w:rPr>
+        <w:rFonts w:ascii="Symbol" w:hAnsi="Symbol" w:hint="default"/>
+      </w:rPr>
+    </w:lvl>
+    <w:lvl w:ilvl="7" w:tplc="40090003" w:tentative="1">
+      <w:start w:val="1"/>
+      <w:numFmt w:val="bullet"/>
+      <w:lvlText w:val="o"/>
+      <w:lvlJc w:val="left"/>
+      <w:pPr>
+        <w:ind w:left="5760" w:hanging="360"/>
+      </w:pPr>
+      <w:rPr>
+        <w:rFonts w:ascii="Courier New" w:hAnsi="Courier New" w:cs="Courier New" w:hint="default"/>
+      </w:rPr>
+    </w:lvl>
+    <w:lvl w:ilvl="8" w:tplc="40090005" w:tentative="1">
+      <w:start w:val="1"/>
+      <w:numFmt w:val="bullet"/>
+      <w:lvlText w:val=""/>
+      <w:lvlJc w:val="left"/>
+      <w:pPr>
+        <w:ind w:left="6480" w:hanging="360"/>
+      </w:pPr>
+      <w:rPr>
+        <w:rFonts w:ascii="Wingdings" w:hAnsi="Wingdings" w:hint="default"/>
+      </w:rPr>
+    </w:lvl>
+  </w:abstractNum>
+  <w:abstractNum w:abstractNumId="1" w15:restartNumberingAfterBreak="0">
+    <w:nsid w:val="20047B0F"/>
+    <w:multiLevelType w:val="hybridMultilevel"/>
+    <w:tmpl w:val="514C2E2E"/>
+    <w:lvl w:ilvl="0" w:tplc="3AEE1FD4">
+      <w:numFmt w:val="bullet"/>
+      <w:lvlText w:val=""/>
+      <w:lvlJc w:val="left"/>
+      <w:pPr>
+        <w:ind w:left="720" w:hanging="360"/>
+      </w:pPr>
+      <w:rPr>
+        <w:rFonts w:ascii="Calibri" w:eastAsiaTheme="minorHAnsi" w:hAnsi="Calibri" w:cs="Calibri" w:hint="default"/>
+      </w:rPr>
+    </w:lvl>
+    <w:lvl w:ilvl="1" w:tplc="40090003" w:tentative="1">
+      <w:start w:val="1"/>
+      <w:numFmt w:val="bullet"/>
+      <w:lvlText w:val="o"/>
+      <w:lvlJc w:val="left"/>
+      <w:pPr>
+        <w:ind w:left="1440" w:hanging="360"/>
+      </w:pPr>
+      <w:rPr>
+        <w:rFonts w:ascii="Courier New" w:hAnsi="Courier New" w:cs="Courier New" w:hint="default"/>
+      </w:rPr>
+    </w:lvl>
+    <w:lvl w:ilvl="2" w:tplc="40090005" w:tentative="1">
+      <w:start w:val="1"/>
+      <w:numFmt w:val="bullet"/>
+      <w:lvlText w:val=""/>
+      <w:lvlJc w:val="left"/>
+      <w:pPr>
+        <w:ind w:left="2160" w:hanging="360"/>
+      </w:pPr>
+      <w:rPr>
+        <w:rFonts w:ascii="Wingdings" w:hAnsi="Wingdings" w:hint="default"/>
+      </w:rPr>
+    </w:lvl>
+    <w:lvl w:ilvl="3" w:tplc="40090001" w:tentative="1">
+      <w:start w:val="1"/>
+      <w:numFmt w:val="bullet"/>
+      <w:lvlText w:val=""/>
+      <w:lvlJc w:val="left"/>
+      <w:pPr>
+        <w:ind w:left="2880" w:hanging="360"/>
+      </w:pPr>
+      <w:rPr>
+        <w:rFonts w:ascii="Symbol" w:hAnsi="Symbol" w:hint="default"/>
+      </w:rPr>
+    </w:lvl>
+    <w:lvl w:ilvl="4" w:tplc="40090003" w:tentative="1">
+      <w:start w:val="1"/>
+      <w:numFmt w:val="bullet"/>
+      <w:lvlText w:val="o"/>
+      <w:lvlJc w:val="left"/>
+      <w:pPr>
+        <w:ind w:left="3600" w:hanging="360"/>
+      </w:pPr>
+      <w:rPr>
+        <w:rFonts w:ascii="Courier New" w:hAnsi="Courier New" w:cs="Courier New" w:hint="default"/>
+      </w:rPr>
+    </w:lvl>
+    <w:lvl w:ilvl="5" w:tplc="40090005" w:tentative="1">
+      <w:start w:val="1"/>
+      <w:numFmt w:val="bullet"/>
+      <w:lvlText w:val=""/>
+      <w:lvlJc w:val="left"/>
+      <w:pPr>
+        <w:ind w:left="4320" w:hanging="360"/>
+      </w:pPr>
+      <w:rPr>
+        <w:rFonts w:ascii="Wingdings" w:hAnsi="Wingdings" w:hint="default"/>
+      </w:rPr>
+    </w:lvl>
+    <w:lvl w:ilvl="6" w:tplc="40090001" w:tentative="1">
+      <w:start w:val="1"/>
+      <w:numFmt w:val="bullet"/>
+      <w:lvlText w:val=""/>
+      <w:lvlJc w:val="left"/>
+      <w:pPr>
+        <w:ind w:left="5040" w:hanging="360"/>
+      </w:pPr>
+      <w:rPr>
+        <w:rFonts w:ascii="Symbol" w:hAnsi="Symbol" w:hint="default"/>
+      </w:rPr>
+    </w:lvl>
+    <w:lvl w:ilvl="7" w:tplc="40090003" w:tentative="1">
+      <w:start w:val="1"/>
+      <w:numFmt w:val="bullet"/>
+      <w:lvlText w:val="o"/>
+      <w:lvlJc w:val="left"/>
+      <w:pPr>
+        <w:ind w:left="5760" w:hanging="360"/>
+      </w:pPr>
+      <w:rPr>
+        <w:rFonts w:ascii="Courier New" w:hAnsi="Courier New" w:cs="Courier New" w:hint="default"/>
+      </w:rPr>
+    </w:lvl>
+    <w:lvl w:ilvl="8" w:tplc="40090005" w:tentative="1">
+      <w:start w:val="1"/>
+      <w:numFmt w:val="bullet"/>
+      <w:lvlText w:val=""/>
+      <w:lvlJc w:val="left"/>
+      <w:pPr>
+        <w:ind w:left="6480" w:hanging="360"/>
+      </w:pPr>
+      <w:rPr>
+        <w:rFonts w:ascii="Wingdings" w:hAnsi="Wingdings" w:hint="default"/>
+      </w:rPr>
+    </w:lvl>
+  </w:abstractNum>
+  <w:abstractNum w:abstractNumId="2" w15:restartNumberingAfterBreak="0">
+    <w:nsid w:val="48CD32F1"/>
+    <w:multiLevelType w:val="multilevel"/>
+    <w:tmpl w:val="1A988BCE"/>
+    <w:lvl w:ilvl="0">
+      <w:start w:val="1"/>
+      <w:numFmt w:val="bullet"/>
+      <w:lvlText w:val=""/>
+      <w:lvlJc w:val="left"/>
+      <w:pPr>
+        <w:tabs>
+          <w:tab w:val="num" w:pos="720"/>
+        </w:tabs>
+        <w:ind w:left="720" w:hanging="360"/>
+      </w:pPr>
+      <w:rPr>
+        <w:rFonts w:ascii="Symbol" w:hAnsi="Symbol" w:hint="default"/>
+        <w:sz w:val="20"/>
+      </w:rPr>
+    </w:lvl>
+    <w:lvl w:ilvl="1" w:tentative="1">
+      <w:start w:val="1"/>
+      <w:numFmt w:val="bullet"/>
+      <w:lvlText w:val="o"/>
+      <w:lvlJc w:val="left"/>
+      <w:pPr>
+        <w:tabs>
+          <w:tab w:val="num" w:pos="1440"/>
+        </w:tabs>
+        <w:ind w:left="1440" w:hanging="360"/>
+      </w:pPr>
+      <w:rPr>
+        <w:rFonts w:ascii="Courier New" w:hAnsi="Courier New" w:hint="default"/>
+        <w:sz w:val="20"/>
+      </w:rPr>
+    </w:lvl>
+    <w:lvl w:ilvl="2" w:tentative="1">
+      <w:start w:val="1"/>
+      <w:numFmt w:val="bullet"/>
+      <w:lvlText w:val=""/>
+      <w:lvlJc w:val="left"/>
+      <w:pPr>
+        <w:tabs>
+          <w:tab w:val="num" w:pos="2160"/>
+        </w:tabs>
+        <w:ind w:left="2160" w:hanging="360"/>
+      </w:pPr>
+      <w:rPr>
+        <w:rFonts w:ascii="Wingdings" w:hAnsi="Wingdings" w:hint="default"/>
+        <w:sz w:val="20"/>
+      </w:rPr>
+    </w:lvl>
+    <w:lvl w:ilvl="3" w:tentative="1">
+      <w:start w:val="1"/>
+      <w:numFmt w:val="bullet"/>
+      <w:lvlText w:val=""/>
+      <w:lvlJc w:val="left"/>
+      <w:pPr>
+        <w:tabs>
+          <w:tab w:val="num" w:pos="2880"/>
+        </w:tabs>
+        <w:ind w:left="2880" w:hanging="360"/>
+      </w:pPr>
+      <w:rPr>
+        <w:rFonts w:ascii="Wingdings" w:hAnsi="Wingdings" w:hint="default"/>
+        <w:sz w:val="20"/>
+      </w:rPr>
+    </w:lvl>
+    <w:lvl w:ilvl="4" w:tentative="1">
+      <w:start w:val="1"/>
+      <w:numFmt w:val="bullet"/>
+      <w:lvlText w:val=""/>
+      <w:lvlJc w:val="left"/>
+      <w:pPr>
+        <w:tabs>
+          <w:tab w:val="num" w:pos="3600"/>
+        </w:tabs>
+        <w:ind w:left="3600" w:hanging="360"/>
+      </w:pPr>
+      <w:rPr>
+        <w:rFonts w:ascii="Wingdings" w:hAnsi="Wingdings" w:hint="default"/>
+        <w:sz w:val="20"/>
+      </w:rPr>
+    </w:lvl>
+    <w:lvl w:ilvl="5" w:tentative="1">
+      <w:start w:val="1"/>
+      <w:numFmt w:val="bullet"/>
+      <w:lvlText w:val=""/>
+      <w:lvlJc w:val="left"/>
+      <w:pPr>
+        <w:tabs>
+          <w:tab w:val="num" w:pos="4320"/>
+        </w:tabs>
+        <w:ind w:left="4320" w:hanging="360"/>
+      </w:pPr>
+      <w:rPr>
+        <w:rFonts w:ascii="Wingdings" w:hAnsi="Wingdings" w:hint="default"/>
+        <w:sz w:val="20"/>
+      </w:rPr>
+    </w:lvl>
+    <w:lvl w:ilvl="6" w:tentative="1">
+      <w:start w:val="1"/>
+      <w:numFmt w:val="bullet"/>
+      <w:lvlText w:val=""/>
+      <w:lvlJc w:val="left"/>
+      <w:pPr>
+        <w:tabs>
+          <w:tab w:val="num" w:pos="5040"/>
+        </w:tabs>
+        <w:ind w:left="5040" w:hanging="360"/>
+      </w:pPr>
+      <w:rPr>
+        <w:rFonts w:ascii="Wingdings" w:hAnsi="Wingdings" w:hint="default"/>
+        <w:sz w:val="20"/>
+      </w:rPr>
+    </w:lvl>
+    <w:lvl w:ilvl="7" w:tentative="1">
+      <w:start w:val="1"/>
+      <w:numFmt w:val="bullet"/>
+      <w:lvlText w:val=""/>
+      <w:lvlJc w:val="left"/>
+      <w:pPr>
+        <w:tabs>
+          <w:tab w:val="num" w:pos="5760"/>
+        </w:tabs>
+        <w:ind w:left="5760" w:hanging="360"/>
+      </w:pPr>
+      <w:rPr>
+        <w:rFonts w:ascii="Wingdings" w:hAnsi="Wingdings" w:hint="default"/>
+        <w:sz w:val="20"/>
+      </w:rPr>
+    </w:lvl>
+    <w:lvl w:ilvl="8" w:tentative="1">
+      <w:start w:val="1"/>
+      <w:numFmt w:val="bullet"/>
+      <w:lvlText w:val=""/>
+      <w:lvlJc w:val="left"/>
+      <w:pPr>
+        <w:tabs>
+          <w:tab w:val="num" w:pos="6480"/>
+        </w:tabs>
+        <w:ind w:left="6480" w:hanging="360"/>
+      </w:pPr>
+      <w:rPr>
+        <w:rFonts w:ascii="Wingdings" w:hAnsi="Wingdings" w:hint="default"/>
+        <w:sz w:val="20"/>
+      </w:rPr>
+    </w:lvl>
+  </w:abstractNum>
+  <w:num w:numId="1" w16cid:durableId="829716211">
+    <w:abstractNumId w:val="0"/>
+  </w:num>
+  <w:num w:numId="2" w16cid:durableId="1205561444">
+    <w:abstractNumId w:val="1"/>
+  </w:num>
+  <w:num w:numId="3" w16cid:durableId="2105374395">
+    <w:abstractNumId w:val="2"/>
+  </w:num>
+</w:numbering>
 </file>
 
 <file path=word/styles.xml><?xml version="1.0" encoding="utf-8"?>
@@ -1504,6 +3103,50 @@
       <w:spacing w:val="5"/>
     </w:rPr>
   </w:style>
+  <w:style w:type="paragraph" w:styleId="Header">
+    <w:name w:val="header"/>
+    <w:basedOn w:val="Normal"/>
+    <w:link w:val="HeaderChar"/>
+    <w:uiPriority w:val="99"/>
+    <w:unhideWhenUsed/>
+    <w:rsid w:val="004F0561"/>
+    <w:pPr>
+      <w:tabs>
+        <w:tab w:val="center" w:pos="4513"/>
+        <w:tab w:val="right" w:pos="9026"/>
+      </w:tabs>
+      <w:spacing w:after="0" w:line="240" w:lineRule="auto"/>
+    </w:pPr>
+  </w:style>
+  <w:style w:type="character" w:customStyle="1" w:styleId="HeaderChar">
+    <w:name w:val="Header Char"/>
+    <w:basedOn w:val="DefaultParagraphFont"/>
+    <w:link w:val="Header"/>
+    <w:uiPriority w:val="99"/>
+    <w:rsid w:val="004F0561"/>
+  </w:style>
+  <w:style w:type="paragraph" w:styleId="Footer">
+    <w:name w:val="footer"/>
+    <w:basedOn w:val="Normal"/>
+    <w:link w:val="FooterChar"/>
+    <w:uiPriority w:val="99"/>
+    <w:unhideWhenUsed/>
+    <w:rsid w:val="004F0561"/>
+    <w:pPr>
+      <w:tabs>
+        <w:tab w:val="center" w:pos="4513"/>
+        <w:tab w:val="right" w:pos="9026"/>
+      </w:tabs>
+      <w:spacing w:after="0" w:line="240" w:lineRule="auto"/>
+    </w:pPr>
+  </w:style>
+  <w:style w:type="character" w:customStyle="1" w:styleId="FooterChar">
+    <w:name w:val="Footer Char"/>
+    <w:basedOn w:val="DefaultParagraphFont"/>
+    <w:link w:val="Footer"/>
+    <w:uiPriority w:val="99"/>
+    <w:rsid w:val="004F0561"/>
+  </w:style>
 </w:styles>
 </file>
 

</xml_diff>